<commit_message>
updated and correct version of project
</commit_message>
<xml_diff>
--- a/084-138 - KamaleshSP-ElumalaiB - FOML LAB/FOML_MiniProject_Report.docx
+++ b/084-138 - KamaleshSP-ElumalaiB - FOML LAB/FOML_MiniProject_Report.docx
@@ -194,7 +194,6 @@
           <w:sz w:val="28"/>
         </w:rPr>
       </w:pPr>
-      <w:proofErr w:type="gramStart"/>
       <w:r>
         <w:rPr>
           <w:b/>
@@ -203,7 +202,6 @@
         </w:rPr>
         <w:t>in</w:t>
       </w:r>
-      <w:proofErr w:type="gramEnd"/>
       <w:r>
         <w:rPr>
           <w:b/>
@@ -409,7 +407,6 @@
           <w:sz w:val="32"/>
         </w:rPr>
       </w:pPr>
-      <w:proofErr w:type="gramStart"/>
       <w:r>
         <w:rPr>
           <w:b/>
@@ -419,7 +416,6 @@
         </w:rPr>
         <w:t>in</w:t>
       </w:r>
-      <w:proofErr w:type="gramEnd"/>
     </w:p>
     <w:p>
       <w:pPr>
@@ -709,25 +705,7 @@
           <w:sz w:val="28"/>
           <w:szCs w:val="28"/>
         </w:rPr>
-        <w:t xml:space="preserve">is the </w:t>
-      </w:r>
-      <w:proofErr w:type="spellStart"/>
-      <w:r>
-        <w:rPr>
-          <w:bCs/>
-          <w:sz w:val="28"/>
-          <w:szCs w:val="28"/>
-        </w:rPr>
-        <w:t>bonafide</w:t>
-      </w:r>
-      <w:proofErr w:type="spellEnd"/>
-      <w:r>
-        <w:rPr>
-          <w:bCs/>
-          <w:sz w:val="28"/>
-          <w:szCs w:val="28"/>
-        </w:rPr>
-        <w:t xml:space="preserve"> work of </w:t>
+        <w:t xml:space="preserve">is the bonafide work of </w:t>
       </w:r>
       <w:r>
         <w:rPr>
@@ -804,23 +782,7 @@
           <w:b w:val="0"/>
           <w:bCs w:val="0"/>
         </w:rPr>
-        <w:t xml:space="preserve">Dr. J. </w:t>
-      </w:r>
-      <w:proofErr w:type="spellStart"/>
-      <w:r>
-        <w:rPr>
-          <w:b w:val="0"/>
-          <w:bCs w:val="0"/>
-        </w:rPr>
-        <w:t>Jinu</w:t>
-      </w:r>
-      <w:proofErr w:type="spellEnd"/>
-      <w:r>
-        <w:rPr>
-          <w:b w:val="0"/>
-          <w:bCs w:val="0"/>
-        </w:rPr>
-        <w:t xml:space="preserve"> Sophia</w:t>
+        <w:t>Dr. J. Jinu Sophia</w:t>
       </w:r>
       <w:r>
         <w:rPr>
@@ -897,14 +859,12 @@
           <w:cols w:space="720"/>
         </w:sectPr>
       </w:pPr>
-      <w:proofErr w:type="spellStart"/>
       <w:r>
         <w:rPr>
           <w:sz w:val="28"/>
         </w:rPr>
         <w:t>Rajalakshmi</w:t>
       </w:r>
-      <w:proofErr w:type="spellEnd"/>
       <w:r>
         <w:rPr>
           <w:spacing w:val="-18"/>
@@ -1025,8 +985,13 @@
         <w:rPr>
           <w:u w:val="single"/>
         </w:rPr>
-        <w:tab/>
-      </w:r>
+        <w:t>19/05/2026</w:t>
+      </w:r>
+      <w:r>
+        <w:t>.</w:t>
+      </w:r>
+      <w:bookmarkStart w:id="0" w:name="_GoBack"/>
+      <w:bookmarkEnd w:id="0"/>
     </w:p>
     <w:p>
       <w:pPr>
@@ -1176,133 +1141,7 @@
           <w:bCs w:val="0"/>
           <w:color w:val="202021"/>
         </w:rPr>
-        <w:t xml:space="preserve">"Loan Harmony Nexus: The Ultimate AI-Powered Shield </w:t>
-      </w:r>
-      <w:proofErr w:type="gramStart"/>
-      <w:r>
-        <w:rPr>
-          <w:b w:val="0"/>
-          <w:bCs w:val="0"/>
-          <w:color w:val="202021"/>
-        </w:rPr>
-        <w:t>Against</w:t>
-      </w:r>
-      <w:proofErr w:type="gramEnd"/>
-      <w:r>
-        <w:rPr>
-          <w:b w:val="0"/>
-          <w:bCs w:val="0"/>
-          <w:color w:val="202021"/>
-        </w:rPr>
-        <w:t xml:space="preserve"> Financial Risk in Digital Lending" is an advanced </w:t>
-      </w:r>
-      <w:proofErr w:type="spellStart"/>
-      <w:r>
-        <w:rPr>
-          <w:b w:val="0"/>
-          <w:bCs w:val="0"/>
-          <w:color w:val="202021"/>
-        </w:rPr>
-        <w:t>fintech</w:t>
-      </w:r>
-      <w:proofErr w:type="spellEnd"/>
-      <w:r>
-        <w:rPr>
-          <w:b w:val="0"/>
-          <w:bCs w:val="0"/>
-          <w:color w:val="202021"/>
-        </w:rPr>
-        <w:t xml:space="preserve"> system designed to revolutionize the loan approval process by minimizing credit risk and enhancing financial inclusion. By integrating state-of-the-art machine learning techniques such as </w:t>
-      </w:r>
-      <w:proofErr w:type="spellStart"/>
-      <w:r>
-        <w:rPr>
-          <w:b w:val="0"/>
-          <w:bCs w:val="0"/>
-          <w:color w:val="202021"/>
-        </w:rPr>
-        <w:t>CatBoost</w:t>
-      </w:r>
-      <w:proofErr w:type="spellEnd"/>
-      <w:r>
-        <w:rPr>
-          <w:b w:val="0"/>
-          <w:bCs w:val="0"/>
-          <w:color w:val="202021"/>
-        </w:rPr>
-        <w:t xml:space="preserve">, </w:t>
-      </w:r>
-      <w:proofErr w:type="spellStart"/>
-      <w:r>
-        <w:rPr>
-          <w:b w:val="0"/>
-          <w:bCs w:val="0"/>
-          <w:color w:val="202021"/>
-        </w:rPr>
-        <w:t>XGBoost</w:t>
-      </w:r>
-      <w:proofErr w:type="spellEnd"/>
-      <w:r>
-        <w:rPr>
-          <w:b w:val="0"/>
-          <w:bCs w:val="0"/>
-          <w:color w:val="202021"/>
-        </w:rPr>
-        <w:t xml:space="preserve">, and Random Forest ensemble methods, the system effectively analyzes complex borrower profiles beyond traditional credit scores. Key attributes evaluated include Debt-to-Income (DTI) ratios, gig economy income stability, utility bill payment patterns, and qualitative behavioral scoring metrics. Leveraging these ensemble learning methods significantly enhances detection accuracy and reliability in identifying potential loan defaults. This platform is developed as a robust full-stack web application using the MERN architecture (MongoDB, Express.js, React, </w:t>
-      </w:r>
-      <w:proofErr w:type="gramStart"/>
-      <w:r>
-        <w:rPr>
-          <w:b w:val="0"/>
-          <w:bCs w:val="0"/>
-          <w:color w:val="202021"/>
-        </w:rPr>
-        <w:t>Node.js</w:t>
-      </w:r>
-      <w:proofErr w:type="gramEnd"/>
-      <w:r>
-        <w:rPr>
-          <w:b w:val="0"/>
-          <w:bCs w:val="0"/>
-          <w:color w:val="202021"/>
-        </w:rPr>
-        <w:t xml:space="preserve">) synchronized with a dedicated Python </w:t>
-      </w:r>
-      <w:proofErr w:type="spellStart"/>
-      <w:r>
-        <w:rPr>
-          <w:b w:val="0"/>
-          <w:bCs w:val="0"/>
-          <w:color w:val="202021"/>
-        </w:rPr>
-        <w:t>FastAPI</w:t>
-      </w:r>
-      <w:proofErr w:type="spellEnd"/>
-      <w:r>
-        <w:rPr>
-          <w:b w:val="0"/>
-          <w:bCs w:val="0"/>
-          <w:color w:val="202021"/>
-        </w:rPr>
-        <w:t xml:space="preserve"> </w:t>
-      </w:r>
-      <w:proofErr w:type="spellStart"/>
-      <w:r>
-        <w:rPr>
-          <w:b w:val="0"/>
-          <w:bCs w:val="0"/>
-          <w:color w:val="202021"/>
-        </w:rPr>
-        <w:t>microservice</w:t>
-      </w:r>
-      <w:proofErr w:type="spellEnd"/>
-      <w:r>
-        <w:rPr>
-          <w:b w:val="0"/>
-          <w:bCs w:val="0"/>
-          <w:color w:val="202021"/>
-        </w:rPr>
-        <w:t xml:space="preserve"> for real-time risk assessment. The system incorporates modern UI/UX principles to provide interactive analytics and transparent decision-making visualizations for lenders. Performance is rigorously evaluated using precision, recall, and F1 score metrics to optimize the balance between loan accessibility and risk mitigation. By providing a scalable, secure, and data-driven solution, "Loan Harmony Nexus" aims to create a more harmonious digital lending ecosystem. It addresses the challenges of credit volatility and manual processing while ensuring the financial security of lending institutions. This innovative approach offers a robust framework for financial administrators and risk analysts to process loan applications with high confidence and efficiency, fostering a more stable and inclusive financial environment.</w:t>
+        <w:t>"Loan Harmony Nexus: The Ultimate AI-Powered Shield Against Financial Risk in Digital Lending" is an advanced fintech system designed to revolutionize the loan approval process by minimizing credit risk and enhancing financial inclusion. By integrating state-of-the-art machine learning techniques such as CatBoost, XGBoost, and Random Forest ensemble methods, the system effectively analyzes complex borrower profiles beyond traditional credit scores. Key attributes evaluated include Debt-to-Income (DTI) ratios, gig economy income stability, utility bill payment patterns, and qualitative behavioral scoring metrics. Leveraging these ensemble learning methods significantly enhances detection accuracy and reliability in identifying potential loan defaults. This platform is developed as a robust full-stack web application using the MERN architecture (MongoDB, Express.js, React, Node.js) synchronized with a dedicated Python FastAPI microservice for real-time risk assessment. The system incorporates modern UI/UX principles to provide interactive analytics and transparent decision-making visualizations for lenders. Performance is rigorously evaluated using precision, recall, and F1 score metrics to optimize the balance between loan accessibility and risk mitigation. By providing a scalable, secure, and data-driven solution, "Loan Harmony Nexus" aims to create a more harmonious digital lending ecosystem. It addresses the challenges of credit volatility and manual processing while ensuring the financial security of lending institutions. This innovative approach offers a robust framework for financial administrators and risk analysts to process loan applications with high confidence and efficiency, fostering a more stable and inclusive financial environment.</w:t>
       </w:r>
     </w:p>
     <w:p>
@@ -5637,9 +5476,7 @@
           <w:sz w:val="26"/>
         </w:rPr>
       </w:pPr>
-      <w:bookmarkStart w:id="0" w:name="_GoBack"/>
-    </w:p>
-    <w:bookmarkEnd w:id="0"/>
+    </w:p>
     <w:p>
       <w:pPr>
         <w:rPr>
@@ -6977,7 +6814,6 @@
                 <w:szCs w:val="26"/>
               </w:rPr>
             </w:pPr>
-            <w:proofErr w:type="spellStart"/>
             <w:r>
               <w:rPr>
                 <w:sz w:val="26"/>
@@ -6985,7 +6821,6 @@
               </w:rPr>
               <w:t>CatBoost</w:t>
             </w:r>
-            <w:proofErr w:type="spellEnd"/>
           </w:p>
         </w:tc>
         <w:tc>
@@ -7507,7 +7342,6 @@
                 <w:szCs w:val="26"/>
               </w:rPr>
             </w:pPr>
-            <w:proofErr w:type="spellStart"/>
             <w:r>
               <w:rPr>
                 <w:sz w:val="26"/>
@@ -7515,7 +7349,6 @@
               </w:rPr>
               <w:t>FastAPI</w:t>
             </w:r>
-            <w:proofErr w:type="spellEnd"/>
           </w:p>
         </w:tc>
         <w:tc>
@@ -7860,31 +7693,13 @@
                 <w:szCs w:val="26"/>
               </w:rPr>
             </w:pPr>
-            <w:proofErr w:type="spellStart"/>
             <w:r>
               <w:rPr>
                 <w:sz w:val="26"/>
                 <w:szCs w:val="26"/>
               </w:rPr>
-              <w:t>SHapley</w:t>
-            </w:r>
-            <w:proofErr w:type="spellEnd"/>
-            <w:r>
-              <w:rPr>
-                <w:sz w:val="26"/>
-                <w:szCs w:val="26"/>
-              </w:rPr>
-              <w:t xml:space="preserve"> Additive </w:t>
-            </w:r>
-            <w:proofErr w:type="spellStart"/>
-            <w:r>
-              <w:rPr>
-                <w:sz w:val="26"/>
-                <w:szCs w:val="26"/>
-              </w:rPr>
-              <w:t>exPlanations</w:t>
-            </w:r>
-            <w:proofErr w:type="spellEnd"/>
+              <w:t>SHapley Additive exPlanations</w:t>
+            </w:r>
           </w:p>
         </w:tc>
       </w:tr>
@@ -8134,55 +7949,7 @@
           <w:b w:val="0"/>
           <w:bCs w:val="0"/>
         </w:rPr>
-        <w:t xml:space="preserve">" is a revolutionary solution designed to transform the traditional loan approval process into a data-driven, secure, and highly accurate system. By leveraging cutting-edge technologies, this platform ensures the reliability and speed of credit risk evaluations. Its core mechanism is powered by a robust </w:t>
-      </w:r>
-      <w:proofErr w:type="spellStart"/>
-      <w:r>
-        <w:rPr>
-          <w:b w:val="0"/>
-          <w:bCs w:val="0"/>
-        </w:rPr>
-        <w:t>microservice</w:t>
-      </w:r>
-      <w:proofErr w:type="spellEnd"/>
-      <w:r>
-        <w:rPr>
-          <w:b w:val="0"/>
-          <w:bCs w:val="0"/>
-        </w:rPr>
-        <w:t xml:space="preserve"> architecture that employs advanced ensemble machine learning techniques such as </w:t>
-      </w:r>
-      <w:proofErr w:type="spellStart"/>
-      <w:r>
-        <w:rPr>
-          <w:b w:val="0"/>
-          <w:bCs w:val="0"/>
-        </w:rPr>
-        <w:t>CatBoost</w:t>
-      </w:r>
-      <w:proofErr w:type="spellEnd"/>
-      <w:r>
-        <w:rPr>
-          <w:b w:val="0"/>
-          <w:bCs w:val="0"/>
-        </w:rPr>
-        <w:t xml:space="preserve">, </w:t>
-      </w:r>
-      <w:proofErr w:type="spellStart"/>
-      <w:r>
-        <w:rPr>
-          <w:b w:val="0"/>
-          <w:bCs w:val="0"/>
-        </w:rPr>
-        <w:t>XGBoost</w:t>
-      </w:r>
-      <w:proofErr w:type="spellEnd"/>
-      <w:r>
-        <w:rPr>
-          <w:b w:val="0"/>
-          <w:bCs w:val="0"/>
-        </w:rPr>
-        <w:t>, and Random Forest, enabling precise identification of creditworthiness and early detection of potential defaults.</w:t>
+        <w:t>" is a revolutionary solution designed to transform the traditional loan approval process into a data-driven, secure, and highly accurate system. By leveraging cutting-edge technologies, this platform ensures the reliability and speed of credit risk evaluations. Its core mechanism is powered by a robust microservice architecture that employs advanced ensemble machine learning techniques such as CatBoost, XGBoost, and Random Forest, enabling precise identification of creditworthiness and early detection of potential defaults.</w:t>
       </w:r>
     </w:p>
     <w:p>
@@ -8242,23 +8009,7 @@
           <w:bCs w:val="0"/>
         </w:rPr>
         <w:tab/>
-        <w:t xml:space="preserve">This evaluation system is deployed as a high-performance web application using the MERN stack (MongoDB, Express.js, React, Node.js), seamlessly integrated with a dedicated Python </w:t>
-      </w:r>
-      <w:proofErr w:type="spellStart"/>
-      <w:r>
-        <w:rPr>
-          <w:b w:val="0"/>
-          <w:bCs w:val="0"/>
-        </w:rPr>
-        <w:t>FastAPI</w:t>
-      </w:r>
-      <w:proofErr w:type="spellEnd"/>
-      <w:r>
-        <w:rPr>
-          <w:b w:val="0"/>
-          <w:bCs w:val="0"/>
-        </w:rPr>
-        <w:t xml:space="preserve"> service for real-time inference. With a modern and intuitive administrative dashboard, the platform enhances accessibility for lenders while providing a transparent application experience for borrowers. Rigorous performance evaluations using precision, recall, and F1 score metrics guarantee that the system maintains high predictive accuracy and operational integrity.</w:t>
+        <w:t>This evaluation system is deployed as a high-performance web application using the MERN stack (MongoDB, Express.js, React, Node.js), seamlessly integrated with a dedicated Python FastAPI service for real-time inference. With a modern and intuitive administrative dashboard, the platform enhances accessibility for lenders while providing a transparent application experience for borrowers. Rigorous performance evaluations using precision, recall, and F1 score metrics guarantee that the system maintains high predictive accuracy and operational integrity.</w:t>
       </w:r>
     </w:p>
     <w:p>
@@ -8405,64 +8156,14 @@
           <w:bCs w:val="0"/>
           <w:i/>
         </w:rPr>
-        <w:t xml:space="preserve">Loan Harmony Nexus: The Ultimate AI-Powered Shield </w:t>
-      </w:r>
-      <w:proofErr w:type="gramStart"/>
+        <w:t>Loan Harmony Nexus: The Ultimate AI-Powered Shield Against Financial Risk in Digital Lending</w:t>
+      </w:r>
       <w:r>
         <w:rPr>
           <w:b w:val="0"/>
           <w:bCs w:val="0"/>
-          <w:i/>
-        </w:rPr>
-        <w:t>Against</w:t>
-      </w:r>
-      <w:proofErr w:type="gramEnd"/>
-      <w:r>
-        <w:rPr>
-          <w:b w:val="0"/>
-          <w:bCs w:val="0"/>
-          <w:i/>
-        </w:rPr>
-        <w:t xml:space="preserve"> Financial Risk in Digital Lending</w:t>
-      </w:r>
-      <w:r>
-        <w:rPr>
-          <w:b w:val="0"/>
-          <w:bCs w:val="0"/>
-        </w:rPr>
-        <w:t xml:space="preserve">" is to develop a sophisticated AI-integrated application that effectively evaluates loan applications while ensuring a secure, transparent, and user-centric approval process. By leveraging advanced machine learning algorithms such as </w:t>
-      </w:r>
-      <w:proofErr w:type="spellStart"/>
-      <w:r>
-        <w:rPr>
-          <w:b w:val="0"/>
-          <w:bCs w:val="0"/>
-        </w:rPr>
-        <w:t>CatBoost</w:t>
-      </w:r>
-      <w:proofErr w:type="spellEnd"/>
-      <w:r>
-        <w:rPr>
-          <w:b w:val="0"/>
-          <w:bCs w:val="0"/>
-        </w:rPr>
-        <w:t xml:space="preserve">, </w:t>
-      </w:r>
-      <w:proofErr w:type="spellStart"/>
-      <w:r>
-        <w:rPr>
-          <w:b w:val="0"/>
-          <w:bCs w:val="0"/>
-        </w:rPr>
-        <w:t>XGBoost</w:t>
-      </w:r>
-      <w:proofErr w:type="spellEnd"/>
-      <w:r>
-        <w:rPr>
-          <w:b w:val="0"/>
-          <w:bCs w:val="0"/>
-        </w:rPr>
-        <w:t>, and Random Forest alongside a scalable cloud-native architecture, the system achieves high accuracy in predicting credit risk. It emphasizes data security and transparency through modern encryption methods, fostering trust between lending institutions and borrowers. With a user-friendly interface, the platform facilitates seamless loan tracking, combats financial volatility, and addresses the challenges of traditional credit bias, ultimately creating a more stable and inclusive digital financial environment.</w:t>
+        </w:rPr>
+        <w:t>" is to develop a sophisticated AI-integrated application that effectively evaluates loan applications while ensuring a secure, transparent, and user-centric approval process. By leveraging advanced machine learning algorithms such as CatBoost, XGBoost, and Random Forest alongside a scalable cloud-native architecture, the system achieves high accuracy in predicting credit risk. It emphasizes data security and transparency through modern encryption methods, fostering trust between lending institutions and borrowers. With a user-friendly interface, the platform facilitates seamless loan tracking, combats financial volatility, and addresses the challenges of traditional credit bias, ultimately creating a more stable and inclusive digital financial environment.</w:t>
       </w:r>
     </w:p>
     <w:p>
@@ -8627,88 +8328,14 @@
             <w:rStyle w:val="Hyperlink"/>
             <w:lang w:val="en-IN"/>
           </w:rPr>
-          <w:t xml:space="preserve">"Loan Approval Prediction based on Machine Learning Approach" [1] (2016) by Kumar, </w:t>
-        </w:r>
-        <w:proofErr w:type="spellStart"/>
-        <w:r>
-          <w:rPr>
-            <w:rStyle w:val="Hyperlink"/>
-            <w:lang w:val="en-IN"/>
-          </w:rPr>
-          <w:t>Arun</w:t>
-        </w:r>
-        <w:proofErr w:type="spellEnd"/>
-        <w:r>
-          <w:rPr>
-            <w:rStyle w:val="Hyperlink"/>
-            <w:lang w:val="en-IN"/>
-          </w:rPr>
-          <w:t xml:space="preserve">, Ishan Garg, and </w:t>
-        </w:r>
-        <w:proofErr w:type="spellStart"/>
-        <w:r>
-          <w:rPr>
-            <w:rStyle w:val="Hyperlink"/>
-            <w:lang w:val="en-IN"/>
-          </w:rPr>
-          <w:t>Sanmeet</w:t>
-        </w:r>
-        <w:proofErr w:type="spellEnd"/>
-        <w:r>
-          <w:rPr>
-            <w:rStyle w:val="Hyperlink"/>
-            <w:lang w:val="en-IN"/>
-          </w:rPr>
-          <w:t xml:space="preserve"> Kaur.</w:t>
+          <w:t>"Loan Approval Prediction based on Machine Learning Approach" [1] (2016) by Kumar, Arun, Ishan Garg, and Sanmeet Kaur.</w:t>
         </w:r>
       </w:hyperlink>
       <w:r>
         <w:rPr>
           <w:lang w:val="en-IN"/>
         </w:rPr>
-        <w:t xml:space="preserve"> Explores the use of basic machine learning algorithms to automate the loan approval process, focusing on improving the efficiency of financial institutions. By </w:t>
-      </w:r>
-      <w:proofErr w:type="spellStart"/>
-      <w:r>
-        <w:rPr>
-          <w:lang w:val="en-IN"/>
-        </w:rPr>
-        <w:t>analyzing</w:t>
-      </w:r>
-      <w:proofErr w:type="spellEnd"/>
-      <w:r>
-        <w:rPr>
-          <w:lang w:val="en-IN"/>
-        </w:rPr>
-        <w:t xml:space="preserve"> historical applicant data such as income, education, and credit history, the study provides a foundational approach to predicting loan eligibility. The proposed solution emphasizes reducing the time and manual </w:t>
-      </w:r>
-      <w:proofErr w:type="spellStart"/>
-      <w:r>
-        <w:rPr>
-          <w:lang w:val="en-IN"/>
-        </w:rPr>
-        <w:t>labor</w:t>
-      </w:r>
-      <w:proofErr w:type="spellEnd"/>
-      <w:r>
-        <w:rPr>
-          <w:lang w:val="en-IN"/>
-        </w:rPr>
-        <w:t xml:space="preserve"> required for processing applications, supporting faster decision-making in the banking sector. This method demonstrates significant potential for improving operational speed by transitioning from manual to automated systems. However, a key limitation lies in its reliance on a relatively small feature set, which may not capture the complexities of modern financial </w:t>
-      </w:r>
-      <w:proofErr w:type="spellStart"/>
-      <w:r>
-        <w:rPr>
-          <w:lang w:val="en-IN"/>
-        </w:rPr>
-        <w:t>behaviors</w:t>
-      </w:r>
-      <w:proofErr w:type="spellEnd"/>
-      <w:r>
-        <w:rPr>
-          <w:lang w:val="en-IN"/>
-        </w:rPr>
-        <w:t>. Expanding the dataset to include non-traditional financial metrics is essential for enhancing the system's predictive power in diverse real-world scenarios.</w:t>
+        <w:t xml:space="preserve"> Explores the use of basic machine learning algorithms to automate the loan approval process, focusing on improving the efficiency of financial institutions. By analyzing historical applicant data such as income, education, and credit history, the study provides a foundational approach to predicting loan eligibility. The proposed solution emphasizes reducing the time and manual labor required for processing applications, supporting faster decision-making in the banking sector. This method demonstrates significant potential for improving operational speed by transitioning from manual to automated systems. However, a key limitation lies in its reliance on a relatively small feature set, which may not capture the complexities of modern financial behaviors. Expanding the dataset to include non-traditional financial metrics is essential for enhancing the system's predictive power in diverse real-world scenarios.</w:t>
       </w:r>
     </w:p>
     <w:p>
@@ -8727,58 +8354,14 @@
             <w:rStyle w:val="Hyperlink"/>
             <w:lang w:val="en-IN"/>
           </w:rPr>
-          <w:t xml:space="preserve">"Prediction for Loan Approval using ML Algorithm" [2] (2021) by </w:t>
-        </w:r>
-        <w:proofErr w:type="spellStart"/>
-        <w:r>
-          <w:rPr>
-            <w:rStyle w:val="Hyperlink"/>
-            <w:lang w:val="en-IN"/>
-          </w:rPr>
-          <w:t>Nikam</w:t>
-        </w:r>
-        <w:proofErr w:type="spellEnd"/>
-        <w:r>
-          <w:rPr>
-            <w:rStyle w:val="Hyperlink"/>
-            <w:lang w:val="en-IN"/>
-          </w:rPr>
-          <w:t>, Shraddha R., and Ashwini S. Kadam.</w:t>
+          <w:t>"Prediction for Loan Approval using ML Algorithm" [2] (2021) by Nikam, Shraddha R., and Ashwini S. Kadam.</w:t>
         </w:r>
       </w:hyperlink>
       <w:r>
         <w:rPr>
           <w:lang w:val="en-IN"/>
         </w:rPr>
-        <w:t xml:space="preserve"> Presents a robust approach to loan risk assessment by employing optimized classification algorithms like Support Vector Machines and Decision Trees. The study focuses on achieving a balance between computational accuracy and processing speed, making it well-suited for high-volume banking environments. By tailoring the algorithm for binary classification of "Approved" or "Rejected" status, the solution addresses the challenge of identifying potential defaulters early in the application lifecycle. This approach demonstrates significant practicality and scalability, offering a reliable framework for risk management. However, a notable limitation lies in the dependency on data </w:t>
-      </w:r>
-      <w:proofErr w:type="spellStart"/>
-      <w:r>
-        <w:rPr>
-          <w:lang w:val="en-IN"/>
-        </w:rPr>
-        <w:t>preprocessing</w:t>
-      </w:r>
-      <w:proofErr w:type="spellEnd"/>
-      <w:r>
-        <w:rPr>
-          <w:lang w:val="en-IN"/>
-        </w:rPr>
-        <w:t xml:space="preserve"> quality, as inconsistent handling of missing values can affect the final recognition of creditworthy applicants. Addressing these </w:t>
-      </w:r>
-      <w:proofErr w:type="spellStart"/>
-      <w:r>
-        <w:rPr>
-          <w:lang w:val="en-IN"/>
-        </w:rPr>
-        <w:t>preprocessing</w:t>
-      </w:r>
-      <w:proofErr w:type="spellEnd"/>
-      <w:r>
-        <w:rPr>
-          <w:lang w:val="en-IN"/>
-        </w:rPr>
-        <w:t xml:space="preserve"> aspects is vital for enhancing the system’s reliability across varied banking datasets.</w:t>
+        <w:t xml:space="preserve"> Presents a robust approach to loan risk assessment by employing optimized classification algorithms like Support Vector Machines and Decision Trees. The study focuses on achieving a balance between computational accuracy and processing speed, making it well-suited for high-volume banking environments. By tailoring the algorithm for binary classification of "Approved" or "Rejected" status, the solution addresses the challenge of identifying potential defaulters early in the application lifecycle. This approach demonstrates significant practicality and scalability, offering a reliable framework for risk management. However, a notable limitation lies in the dependency on data preprocessing quality, as inconsistent handling of missing values can affect the final recognition of creditworthy applicants. Addressing these preprocessing aspects is vital for enhancing the system’s reliability across varied banking datasets.</w:t>
       </w:r>
     </w:p>
     <w:p>
@@ -8797,92 +8380,14 @@
             <w:rStyle w:val="Hyperlink"/>
             <w:lang w:val="en-IN"/>
           </w:rPr>
-          <w:t xml:space="preserve">"Predict Loan Approval in Banking System: Machine Learning Approach for Cooperative Banks" [3] (2020) by </w:t>
-        </w:r>
-        <w:proofErr w:type="spellStart"/>
-        <w:r>
-          <w:rPr>
-            <w:rStyle w:val="Hyperlink"/>
-            <w:lang w:val="en-IN"/>
-          </w:rPr>
-          <w:t>Aphale</w:t>
-        </w:r>
-        <w:proofErr w:type="spellEnd"/>
-        <w:r>
-          <w:rPr>
-            <w:rStyle w:val="Hyperlink"/>
-            <w:lang w:val="en-IN"/>
-          </w:rPr>
-          <w:t xml:space="preserve">, </w:t>
-        </w:r>
-        <w:proofErr w:type="spellStart"/>
-        <w:r>
-          <w:rPr>
-            <w:rStyle w:val="Hyperlink"/>
-            <w:lang w:val="en-IN"/>
-          </w:rPr>
-          <w:t>Amruta</w:t>
-        </w:r>
-        <w:proofErr w:type="spellEnd"/>
-        <w:r>
-          <w:rPr>
-            <w:rStyle w:val="Hyperlink"/>
-            <w:lang w:val="en-IN"/>
-          </w:rPr>
-          <w:t xml:space="preserve"> S., and </w:t>
-        </w:r>
-        <w:proofErr w:type="spellStart"/>
-        <w:r>
-          <w:rPr>
-            <w:rStyle w:val="Hyperlink"/>
-            <w:lang w:val="en-IN"/>
-          </w:rPr>
-          <w:t>Prof.</w:t>
-        </w:r>
-        <w:proofErr w:type="spellEnd"/>
-        <w:r>
-          <w:rPr>
-            <w:rStyle w:val="Hyperlink"/>
-            <w:lang w:val="en-IN"/>
-          </w:rPr>
-          <w:t xml:space="preserve"> </w:t>
-        </w:r>
-        <w:proofErr w:type="spellStart"/>
-        <w:r>
-          <w:rPr>
-            <w:rStyle w:val="Hyperlink"/>
-            <w:lang w:val="en-IN"/>
-          </w:rPr>
-          <w:t>Dr.</w:t>
-        </w:r>
-        <w:proofErr w:type="spellEnd"/>
-        <w:r>
-          <w:rPr>
-            <w:rStyle w:val="Hyperlink"/>
-            <w:lang w:val="en-IN"/>
-          </w:rPr>
-          <w:t xml:space="preserve"> Sandeep R.</w:t>
+          <w:t>"Predict Loan Approval in Banking System: Machine Learning Approach for Cooperative Banks" [3] (2020) by Aphale, Amruta S., and Prof. Dr. Sandeep R.</w:t>
         </w:r>
       </w:hyperlink>
       <w:r>
         <w:rPr>
           <w:lang w:val="en-IN"/>
         </w:rPr>
-        <w:t xml:space="preserve"> </w:t>
-      </w:r>
-      <w:proofErr w:type="spellStart"/>
-      <w:r>
-        <w:rPr>
-          <w:lang w:val="en-IN"/>
-        </w:rPr>
-        <w:t>Shinde</w:t>
-      </w:r>
-      <w:proofErr w:type="spellEnd"/>
-      <w:r>
-        <w:rPr>
-          <w:lang w:val="en-IN"/>
-        </w:rPr>
-        <w:t xml:space="preserve"> addresses the challenge of credit risk evaluation specifically within the context of cooperative banking systems. The study employs varied machine learning techniques to fine-tune prediction models, aiming to reduce non-performing assets through data-driven insights. This systematic evaluation process demonstrates improvements in identifying reliable borrowers, validated through a series of performance metrics to emphasize the model's robustness. The proposed approach effectively enhances the decision-making process for small-scale lenders, making it a valuable tool for localized financial applications. However, a notable limitation is the high computational overhead during the training phase for ensemble models, which can restrict usability in resource-constrained environments. Developing more efficient training strategies is crucial to overcoming this limitation and ensuring broader adoption across smaller financial institutions.</w:t>
+        <w:t xml:space="preserve"> Shinde addresses the challenge of credit risk evaluation specifically within the context of cooperative banking systems. The study employs varied machine learning techniques to fine-tune prediction models, aiming to reduce non-performing assets through data-driven insights. This systematic evaluation process demonstrates improvements in identifying reliable borrowers, validated through a series of performance metrics to emphasize the model's robustness. The proposed approach effectively enhances the decision-making process for small-scale lenders, making it a valuable tool for localized financial applications. However, a notable limitation is the high computational overhead during the training phase for ensemble models, which can restrict usability in resource-constrained environments. Developing more efficient training strategies is crucial to overcoming this limitation and ensuring broader adoption across smaller financial institutions.</w:t>
       </w:r>
     </w:p>
     <w:p>
@@ -8912,39 +8417,7 @@
             <w:rStyle w:val="Hyperlink"/>
             <w:lang w:val="en-IN"/>
           </w:rPr>
-          <w:t xml:space="preserve">"Loan Approval Prediction" [4] (2022) by </w:t>
-        </w:r>
-        <w:proofErr w:type="spellStart"/>
-        <w:r>
-          <w:rPr>
-            <w:rStyle w:val="Hyperlink"/>
-            <w:lang w:val="en-IN"/>
-          </w:rPr>
-          <w:t>Nalawade</w:t>
-        </w:r>
-        <w:proofErr w:type="spellEnd"/>
-        <w:r>
-          <w:rPr>
-            <w:rStyle w:val="Hyperlink"/>
-            <w:lang w:val="en-IN"/>
-          </w:rPr>
-          <w:t xml:space="preserve">, </w:t>
-        </w:r>
-        <w:proofErr w:type="spellStart"/>
-        <w:r>
-          <w:rPr>
-            <w:rStyle w:val="Hyperlink"/>
-            <w:lang w:val="en-IN"/>
-          </w:rPr>
-          <w:t>Shubham</w:t>
-        </w:r>
-        <w:proofErr w:type="spellEnd"/>
-        <w:r>
-          <w:rPr>
-            <w:rStyle w:val="Hyperlink"/>
-            <w:lang w:val="en-IN"/>
-          </w:rPr>
-          <w:t>, et al.</w:t>
+          <w:t>"Loan Approval Prediction" [4] (2022) by Nalawade, Shubham, et al.</w:t>
         </w:r>
       </w:hyperlink>
       <w:r>
@@ -8970,53 +8443,14 @@
             <w:rStyle w:val="Hyperlink"/>
             <w:lang w:val="en-IN"/>
           </w:rPr>
-          <w:t xml:space="preserve">"A Comparative Study of Loan Approval Prediction Using Machine Learning Methods" [5] (2024) by </w:t>
+          <w:t>"A Comparative Study of Loan Approval Prediction Using Machine Learning Methods" [5] (2024) by Sinap, Vahid</w:t>
         </w:r>
-        <w:proofErr w:type="spellStart"/>
-        <w:r>
-          <w:rPr>
-            <w:rStyle w:val="Hyperlink"/>
-            <w:lang w:val="en-IN"/>
-          </w:rPr>
-          <w:t>Sinap</w:t>
-        </w:r>
-        <w:proofErr w:type="spellEnd"/>
-        <w:r>
-          <w:rPr>
-            <w:rStyle w:val="Hyperlink"/>
-            <w:lang w:val="en-IN"/>
-          </w:rPr>
-          <w:t xml:space="preserve">, </w:t>
-        </w:r>
-        <w:proofErr w:type="spellStart"/>
-        <w:r>
-          <w:rPr>
-            <w:rStyle w:val="Hyperlink"/>
-            <w:lang w:val="en-IN"/>
-          </w:rPr>
-          <w:t>Vahid</w:t>
-        </w:r>
-        <w:proofErr w:type="spellEnd"/>
       </w:hyperlink>
       <w:r>
         <w:rPr>
           <w:lang w:val="en-IN"/>
         </w:rPr>
-        <w:t xml:space="preserve">, surveys the modern landscape of credit risk assessment, highlighting the strengths of machine learning in ensuring financial stability and transparency. The paper reviews key </w:t>
-      </w:r>
-      <w:proofErr w:type="spellStart"/>
-      <w:r>
-        <w:rPr>
-          <w:lang w:val="en-IN"/>
-        </w:rPr>
-        <w:t>modeling</w:t>
-      </w:r>
-      <w:proofErr w:type="spellEnd"/>
-      <w:r>
-        <w:rPr>
-          <w:lang w:val="en-IN"/>
-        </w:rPr>
-        <w:t xml:space="preserve"> mechanisms such as Random Forest, Logistic Regression, and Support Vector Machines, which play a crucial role in maintaining the integrity of the lending process. It discusses how these mechanisms contribute to the overall security of financial systems by identifying high-risk applicants before credit is extended. This comparative analysis demonstrates the evolution of predictive accuracy in the banking sector. However, the paper also addresses significant challenges, including the black-box nature of some complex models and the resulting lack of interpretability for loan officers. To tackle these challenges, the paper suggests further research into explainable AI techniques that can provide human-readable justifications for automated loan decisions, furthering machine learning's applicability in highly regulated sectors.</w:t>
+        <w:t>, surveys the modern landscape of credit risk assessment, highlighting the strengths of machine learning in ensuring financial stability and transparency. The paper reviews key modeling mechanisms such as Random Forest, Logistic Regression, and Support Vector Machines, which play a crucial role in maintaining the integrity of the lending process. It discusses how these mechanisms contribute to the overall security of financial systems by identifying high-risk applicants before credit is extended. This comparative analysis demonstrates the evolution of predictive accuracy in the banking sector. However, the paper also addresses significant challenges, including the black-box nature of some complex models and the resulting lack of interpretability for loan officers. To tackle these challenges, the paper suggests further research into explainable AI techniques that can provide human-readable justifications for automated loan decisions, furthering machine learning's applicability in highly regulated sectors.</w:t>
       </w:r>
     </w:p>
     <w:p>
@@ -9046,69 +8480,14 @@
             <w:rStyle w:val="Hyperlink"/>
             <w:lang w:val="en-IN"/>
           </w:rPr>
-          <w:t xml:space="preserve">"Loan Approval Prediction Based on Machine Learning Approach" [6] (2022) by </w:t>
+          <w:t>"Loan Approval Prediction Based on Machine Learning Approach" [6] (2022) by Nureni, Azeez A., and O. E. Adekola</w:t>
         </w:r>
-        <w:proofErr w:type="spellStart"/>
-        <w:r>
-          <w:rPr>
-            <w:rStyle w:val="Hyperlink"/>
-            <w:lang w:val="en-IN"/>
-          </w:rPr>
-          <w:t>Nureni</w:t>
-        </w:r>
-        <w:proofErr w:type="spellEnd"/>
-        <w:r>
-          <w:rPr>
-            <w:rStyle w:val="Hyperlink"/>
-            <w:lang w:val="en-IN"/>
-          </w:rPr>
-          <w:t xml:space="preserve">, </w:t>
-        </w:r>
-        <w:proofErr w:type="spellStart"/>
-        <w:r>
-          <w:rPr>
-            <w:rStyle w:val="Hyperlink"/>
-            <w:lang w:val="en-IN"/>
-          </w:rPr>
-          <w:t>Azeez</w:t>
-        </w:r>
-        <w:proofErr w:type="spellEnd"/>
-        <w:r>
-          <w:rPr>
-            <w:rStyle w:val="Hyperlink"/>
-            <w:lang w:val="en-IN"/>
-          </w:rPr>
-          <w:t xml:space="preserve"> A., and O. E. </w:t>
-        </w:r>
-        <w:proofErr w:type="spellStart"/>
-        <w:r>
-          <w:rPr>
-            <w:rStyle w:val="Hyperlink"/>
-            <w:lang w:val="en-IN"/>
-          </w:rPr>
-          <w:t>Adekola</w:t>
-        </w:r>
-        <w:proofErr w:type="spellEnd"/>
       </w:hyperlink>
       <w:r>
         <w:rPr>
           <w:lang w:val="en-IN"/>
         </w:rPr>
-        <w:t xml:space="preserve">, provides an in-depth exploration of predictive </w:t>
-      </w:r>
-      <w:proofErr w:type="spellStart"/>
-      <w:r>
-        <w:rPr>
-          <w:lang w:val="en-IN"/>
-        </w:rPr>
-        <w:t>modeling</w:t>
-      </w:r>
-      <w:proofErr w:type="spellEnd"/>
-      <w:r>
-        <w:rPr>
-          <w:lang w:val="en-IN"/>
-        </w:rPr>
-        <w:t>, examining the benefits of varied algorithms in the context of commercial lending. The paper highlights how automated systems offer solutions for enhancing data security, transparency, and trust by using objective metrics to ensure unbiased and verifiable loan approvals. It also outlines the potential of machine learning in sectors beyond traditional banking, such as micro-lending and peer-to-peer finance. However, the review acknowledges significant challenges, including the complexity of integrating advanced ML models into existing legacy banking infrastructures. These integration hurdles must be addressed to unlock the full potential of automated credit assessment. The paper concludes by identifying several promising areas for future research, such as improving real-time data ingestion and developing cross-platform interoperability for financial datasets, ensuring the long-term viability of AI in the banking industry.</w:t>
+        <w:t>, provides an in-depth exploration of predictive modeling, examining the benefits of varied algorithms in the context of commercial lending. The paper highlights how automated systems offer solutions for enhancing data security, transparency, and trust by using objective metrics to ensure unbiased and verifiable loan approvals. It also outlines the potential of machine learning in sectors beyond traditional banking, such as micro-lending and peer-to-peer finance. However, the review acknowledges significant challenges, including the complexity of integrating advanced ML models into existing legacy banking infrastructures. These integration hurdles must be addressed to unlock the full potential of automated credit assessment. The paper concludes by identifying several promising areas for future research, such as improving real-time data ingestion and developing cross-platform interoperability for financial datasets, ensuring the long-term viability of AI in the banking industry.</w:t>
       </w:r>
     </w:p>
     <w:p>
@@ -9127,72 +8506,14 @@
             <w:rStyle w:val="Hyperlink"/>
             <w:lang w:val="en-IN"/>
           </w:rPr>
-          <w:t xml:space="preserve">"Machine Learning for an Enhanced Credit Risk Analysis: Integrating Mental Health Data" [7] (2024) by </w:t>
-        </w:r>
-        <w:proofErr w:type="spellStart"/>
-        <w:r>
-          <w:rPr>
-            <w:rStyle w:val="Hyperlink"/>
-            <w:lang w:val="en-IN"/>
-          </w:rPr>
-          <w:t>Alagic</w:t>
-        </w:r>
-        <w:proofErr w:type="spellEnd"/>
-        <w:r>
-          <w:rPr>
-            <w:rStyle w:val="Hyperlink"/>
-            <w:lang w:val="en-IN"/>
-          </w:rPr>
-          <w:t>, Adnan, et al.</w:t>
+          <w:t>"Machine Learning for an Enhanced Credit Risk Analysis: Integrating Mental Health Data" [7] (2024) by Alagic, Adnan, et al.</w:t>
         </w:r>
       </w:hyperlink>
       <w:r>
         <w:rPr>
           <w:lang w:val="en-IN"/>
         </w:rPr>
-        <w:t xml:space="preserve">, explores the novel application of integrating psychological and </w:t>
-      </w:r>
-      <w:proofErr w:type="spellStart"/>
-      <w:r>
-        <w:rPr>
-          <w:lang w:val="en-IN"/>
-        </w:rPr>
-        <w:t>behavioral</w:t>
-      </w:r>
-      <w:proofErr w:type="spellEnd"/>
-      <w:r>
-        <w:rPr>
-          <w:lang w:val="en-IN"/>
-        </w:rPr>
-        <w:t xml:space="preserve"> metrics into traditional credit risk assessment frameworks. The paper proposes a comprehensive system that </w:t>
-      </w:r>
-      <w:proofErr w:type="spellStart"/>
-      <w:r>
-        <w:rPr>
-          <w:lang w:val="en-IN"/>
-        </w:rPr>
-        <w:t>analyzes</w:t>
-      </w:r>
-      <w:proofErr w:type="spellEnd"/>
-      <w:r>
-        <w:rPr>
-          <w:lang w:val="en-IN"/>
-        </w:rPr>
-        <w:t xml:space="preserve"> non-traditional data points to provide a more holistic view of a borrower's reliability. By leveraging ensemble learning models, this approach enhances the transparency and depth of the credit evaluation process, providing lenders with more nuanced information. The study highlights the potential of including </w:t>
-      </w:r>
-      <w:proofErr w:type="spellStart"/>
-      <w:r>
-        <w:rPr>
-          <w:lang w:val="en-IN"/>
-        </w:rPr>
-        <w:t>behavioral</w:t>
-      </w:r>
-      <w:proofErr w:type="spellEnd"/>
-      <w:r>
-        <w:rPr>
-          <w:lang w:val="en-IN"/>
-        </w:rPr>
-        <w:t xml:space="preserve"> analytics to reduce misinformation and improve the reliability of risk scores for "thin-file" borrowers. However, the paper also identifies significant challenges such as the ethical implications of using personal health data and the difficulty of ensuring user privacy in centralized databases. Future research directions include developing privacy-preserving techniques like federated learning to foster a more secure and ethical digital financial ecosystem.</w:t>
+        <w:t>, explores the novel application of integrating psychological and behavioral metrics into traditional credit risk assessment frameworks. The paper proposes a comprehensive system that analyzes non-traditional data points to provide a more holistic view of a borrower's reliability. By leveraging ensemble learning models, this approach enhances the transparency and depth of the credit evaluation process, providing lenders with more nuanced information. The study highlights the potential of including behavioral analytics to reduce misinformation and improve the reliability of risk scores for "thin-file" borrowers. However, the paper also identifies significant challenges such as the ethical implications of using personal health data and the difficulty of ensuring user privacy in centralized databases. Future research directions include developing privacy-preserving techniques like federated learning to foster a more secure and ethical digital financial ecosystem.</w:t>
       </w:r>
     </w:p>
     <w:p>
@@ -9223,44 +8544,14 @@
             <w:rStyle w:val="Hyperlink"/>
             <w:lang w:val="en-IN"/>
           </w:rPr>
-          <w:t xml:space="preserve">"Loan Approval Prediction Model: A Comparative Analysis" [8] (2021) by Khan, </w:t>
-        </w:r>
-        <w:proofErr w:type="spellStart"/>
-        <w:r>
-          <w:rPr>
-            <w:rStyle w:val="Hyperlink"/>
-            <w:lang w:val="en-IN"/>
-          </w:rPr>
-          <w:t>Afrah</w:t>
-        </w:r>
-        <w:proofErr w:type="spellEnd"/>
-        <w:r>
-          <w:rPr>
-            <w:rStyle w:val="Hyperlink"/>
-            <w:lang w:val="en-IN"/>
-          </w:rPr>
-          <w:t>, et al.</w:t>
+          <w:t>"Loan Approval Prediction Model: A Comparative Analysis" [8] (2021) by Khan, Afrah, et al.</w:t>
         </w:r>
       </w:hyperlink>
       <w:r>
         <w:rPr>
           <w:lang w:val="en-IN"/>
         </w:rPr>
-        <w:t xml:space="preserve">, examines the use of machine learning to combat inefficiencies and human errors within the loan approval process. The paper proposes a structured model that records and </w:t>
-      </w:r>
-      <w:proofErr w:type="spellStart"/>
-      <w:r>
-        <w:rPr>
-          <w:lang w:val="en-IN"/>
-        </w:rPr>
-        <w:t>analyzes</w:t>
-      </w:r>
-      <w:proofErr w:type="spellEnd"/>
-      <w:r>
-        <w:rPr>
-          <w:lang w:val="en-IN"/>
-        </w:rPr>
-        <w:t xml:space="preserve"> applicant features to ensure transparency and accountability in credit decisions. By leveraging the predictive nature of algorithms like Random Forest, the system can effectively minimize the risk of loan defaults and enhance the overall reliability of the banking system. This approach not only secures the institution's financial health but also improves operational efficiency by streamlining the workflow from application to approval. The study further explores the practical benefits of implementing ML in finance, including heightened trust among stakeholders and better portfolio management. However, challenges such as high initial implementation costs and the need for specialized personnel are acknowledged. Future research is needed to address these barriers, paving the way for broader adoption in the mid-market banking sector.</w:t>
+        <w:t>, examines the use of machine learning to combat inefficiencies and human errors within the loan approval process. The paper proposes a structured model that records and analyzes applicant features to ensure transparency and accountability in credit decisions. By leveraging the predictive nature of algorithms like Random Forest, the system can effectively minimize the risk of loan defaults and enhance the overall reliability of the banking system. This approach not only secures the institution's financial health but also improves operational efficiency by streamlining the workflow from application to approval. The study further explores the practical benefits of implementing ML in finance, including heightened trust among stakeholders and better portfolio management. However, challenges such as high initial implementation costs and the need for specialized personnel are acknowledged. Future research is needed to address these barriers, paving the way for broader adoption in the mid-market banking sector.</w:t>
       </w:r>
     </w:p>
     <w:p>
@@ -9287,23 +8578,7 @@
             <w:lang w:val="en-IN"/>
           </w:rPr>
           <w:lastRenderedPageBreak/>
-          <w:t xml:space="preserve">(2023) by Uddin, </w:t>
-        </w:r>
-        <w:proofErr w:type="spellStart"/>
-        <w:r>
-          <w:rPr>
-            <w:rStyle w:val="Hyperlink"/>
-            <w:lang w:val="en-IN"/>
-          </w:rPr>
-          <w:t>Nazim</w:t>
-        </w:r>
-        <w:proofErr w:type="spellEnd"/>
-        <w:r>
-          <w:rPr>
-            <w:rStyle w:val="Hyperlink"/>
-            <w:lang w:val="en-IN"/>
-          </w:rPr>
-          <w:t>, et al.</w:t>
+          <w:t>(2023) by Uddin, Nazim, et al.</w:t>
         </w:r>
       </w:hyperlink>
       <w:r>
@@ -9341,69 +8616,14 @@
             <w:rStyle w:val="Hyperlink"/>
             <w:lang w:val="en-IN"/>
           </w:rPr>
-          <w:t xml:space="preserve">"Prediction of Home Loan Approval with Machine Learning" [10] (2024) by </w:t>
+          <w:t>"Prediction of Home Loan Approval with Machine Learning" [10] (2024) by Güder, Gamze, and Utku Köse</w:t>
         </w:r>
-        <w:proofErr w:type="spellStart"/>
-        <w:r>
-          <w:rPr>
-            <w:rStyle w:val="Hyperlink"/>
-            <w:lang w:val="en-IN"/>
-          </w:rPr>
-          <w:t>Güder</w:t>
-        </w:r>
-        <w:proofErr w:type="spellEnd"/>
-        <w:r>
-          <w:rPr>
-            <w:rStyle w:val="Hyperlink"/>
-            <w:lang w:val="en-IN"/>
-          </w:rPr>
-          <w:t xml:space="preserve">, Gamze, and </w:t>
-        </w:r>
-        <w:proofErr w:type="spellStart"/>
-        <w:r>
-          <w:rPr>
-            <w:rStyle w:val="Hyperlink"/>
-            <w:lang w:val="en-IN"/>
-          </w:rPr>
-          <w:t>Utku</w:t>
-        </w:r>
-        <w:proofErr w:type="spellEnd"/>
-        <w:r>
-          <w:rPr>
-            <w:rStyle w:val="Hyperlink"/>
-            <w:lang w:val="en-IN"/>
-          </w:rPr>
-          <w:t xml:space="preserve"> </w:t>
-        </w:r>
-        <w:proofErr w:type="spellStart"/>
-        <w:r>
-          <w:rPr>
-            <w:rStyle w:val="Hyperlink"/>
-            <w:lang w:val="en-IN"/>
-          </w:rPr>
-          <w:t>Köse</w:t>
-        </w:r>
-        <w:proofErr w:type="spellEnd"/>
       </w:hyperlink>
       <w:r>
         <w:rPr>
           <w:lang w:val="en-IN"/>
         </w:rPr>
-        <w:t xml:space="preserve"> provides an in-depth examination of mortgage-specific predictive </w:t>
-      </w:r>
-      <w:proofErr w:type="spellStart"/>
-      <w:r>
-        <w:rPr>
-          <w:lang w:val="en-IN"/>
-        </w:rPr>
-        <w:t>modeling</w:t>
-      </w:r>
-      <w:proofErr w:type="spellEnd"/>
-      <w:r>
-        <w:rPr>
-          <w:lang w:val="en-IN"/>
-        </w:rPr>
-        <w:t>, delving into its architecture and core principles. The paper outlines the fundamental components of the home loan process, including the evaluation of property value, applicant income, and debt ratios, which collectively enable transparent data management. It highlights the potential of machine learning to revolutionize the real estate finance industry by enhancing trust and operational efficiency in long-term lending. Additionally, the paper explores critical data integrity implications, emphasizing the system's strength in identifying sustainable repayment patterns. It also identifies challenges, such as the volatility of real estate markets and the impact of fluctuating interest rates on model performance. The authors propose future directions for research focusing on adaptive learning models that can adjust to economic shifts, ultimately paving the way for more resilient mortgage approval systems.</w:t>
+        <w:t xml:space="preserve"> provides an in-depth examination of mortgage-specific predictive modeling, delving into its architecture and core principles. The paper outlines the fundamental components of the home loan process, including the evaluation of property value, applicant income, and debt ratios, which collectively enable transparent data management. It highlights the potential of machine learning to revolutionize the real estate finance industry by enhancing trust and operational efficiency in long-term lending. Additionally, the paper explores critical data integrity implications, emphasizing the system's strength in identifying sustainable repayment patterns. It also identifies challenges, such as the volatility of real estate markets and the impact of fluctuating interest rates on model performance. The authors propose future directions for research focusing on adaptive learning models that can adjust to economic shifts, ultimately paving the way for more resilient mortgage approval systems.</w:t>
       </w:r>
     </w:p>
     <w:p>
@@ -10903,14 +10123,12 @@
                 <w:sz w:val="28"/>
               </w:rPr>
             </w:pPr>
-            <w:proofErr w:type="spellStart"/>
             <w:r>
               <w:rPr>
                 <w:sz w:val="28"/>
               </w:rPr>
               <w:t>ReactJS,CSS</w:t>
             </w:r>
-            <w:proofErr w:type="spellEnd"/>
           </w:p>
         </w:tc>
       </w:tr>
@@ -11002,28 +10220,12 @@
                 <w:sz w:val="28"/>
               </w:rPr>
             </w:pPr>
-            <w:proofErr w:type="spellStart"/>
             <w:r>
               <w:rPr>
                 <w:sz w:val="28"/>
               </w:rPr>
-              <w:t>Scikit</w:t>
-            </w:r>
-            <w:proofErr w:type="spellEnd"/>
-            <w:r>
-              <w:rPr>
-                <w:sz w:val="28"/>
-              </w:rPr>
-              <w:t xml:space="preserve">-learn, Pandas, </w:t>
-            </w:r>
-            <w:proofErr w:type="spellStart"/>
-            <w:r>
-              <w:rPr>
-                <w:sz w:val="28"/>
-              </w:rPr>
-              <w:t>NumPy</w:t>
-            </w:r>
-            <w:proofErr w:type="spellEnd"/>
+              <w:t>Scikit-learn, Pandas, NumPy</w:t>
+            </w:r>
           </w:p>
         </w:tc>
       </w:tr>
@@ -11225,23 +10427,7 @@
           <w:b w:val="0"/>
           <w:bCs w:val="0"/>
         </w:rPr>
-        <w:t xml:space="preserve">The activity diagram Fig 3.2 represents the workflow for assessing loan risk using the Loan Harmony Nexus platform. The process begins with the applicant submitting their loan request and financial details via the </w:t>
-      </w:r>
-      <w:proofErr w:type="spellStart"/>
-      <w:r>
-        <w:rPr>
-          <w:b w:val="0"/>
-          <w:bCs w:val="0"/>
-        </w:rPr>
-        <w:t>ReactJS</w:t>
-      </w:r>
-      <w:proofErr w:type="spellEnd"/>
-      <w:r>
-        <w:rPr>
-          <w:b w:val="0"/>
-          <w:bCs w:val="0"/>
-        </w:rPr>
-        <w:t xml:space="preserve"> frontend. The Flask framework serves as the backend, receiving the data and passing it to the preprocessing module. Here, financial metrics like the Debt-to-Income (DTI) ratio are calculated, and categorical data like employment status is encoded. These preprocessed features are then fed into the Gradient Boosting model. The model evaluates the risk level and generates a classification (Approved or Rejected) along with a probability score. Finally, the decision is displayed to the user and recorded in the database, providing a streamlined and objective credit evaluation process.</w:t>
+        <w:t>The activity diagram Fig 3.2 represents the workflow for assessing loan risk using the Loan Harmony Nexus platform. The process begins with the applicant submitting their loan request and financial details via the ReactJS frontend. The Flask framework serves as the backend, receiving the data and passing it to the preprocessing module. Here, financial metrics like the Debt-to-Income (DTI) ratio are calculated, and categorical data like employment status is encoded. These preprocessed features are then fed into the Gradient Boosting model. The model evaluates the risk level and generates a classification (Approved or Rejected) along with a probability score. Finally, the decision is displayed to the user and recorded in the database, providing a streamlined and objective credit evaluation process.</w:t>
       </w:r>
     </w:p>
     <w:p>
@@ -11501,21 +10687,7 @@
         <w:rPr>
           <w:lang w:val="en-IN"/>
         </w:rPr>
-        <w:t xml:space="preserve">The feature comparison table highlights the key differences between the Loan Harmony Nexus model and traditional manual credit assessment methods. The proposed system integrates advanced AI features, including automated DTI calculation and ensemble risk </w:t>
-      </w:r>
-      <w:proofErr w:type="spellStart"/>
-      <w:r>
-        <w:rPr>
-          <w:lang w:val="en-IN"/>
-        </w:rPr>
-        <w:t>modeling</w:t>
-      </w:r>
-      <w:proofErr w:type="spellEnd"/>
-      <w:r>
-        <w:rPr>
-          <w:lang w:val="en-IN"/>
-        </w:rPr>
-        <w:t>, ensuring a more objective and secure lending environment.</w:t>
+        <w:t>The feature comparison table highlights the key differences between the Loan Harmony Nexus model and traditional manual credit assessment methods. The proposed system integrates advanced AI features, including automated DTI calculation and ensemble risk modeling, ensuring a more objective and secure lending environment.</w:t>
       </w:r>
     </w:p>
     <w:p>
@@ -11939,7 +11111,6 @@
                 <w:szCs w:val="24"/>
               </w:rPr>
             </w:pPr>
-            <w:proofErr w:type="spellStart"/>
             <w:r>
               <w:rPr>
                 <w:b/>
@@ -11949,7 +11120,6 @@
               </w:rPr>
               <w:t>Preprocessing</w:t>
             </w:r>
-            <w:proofErr w:type="spellEnd"/>
           </w:p>
         </w:tc>
         <w:tc>
@@ -12470,23 +11640,7 @@
           <w:sz w:val="26"/>
           <w:szCs w:val="26"/>
         </w:rPr>
-        <w:t xml:space="preserve">The Loan Harmony Nexus platform stands out through its innovative features, distinguishing it from traditional bank lending workflows. Notably, it integrates advanced machine learning techniques such as Gradient Boosting and Random Forest to enhance risk detection accuracy and reliability. Additionally, the system leverages a centralized MongoDB database for efficient data management and </w:t>
-      </w:r>
-      <w:proofErr w:type="spellStart"/>
-      <w:r>
-        <w:rPr>
-          <w:sz w:val="26"/>
-          <w:szCs w:val="26"/>
-        </w:rPr>
-        <w:t>ReactJS</w:t>
-      </w:r>
-      <w:proofErr w:type="spellEnd"/>
-      <w:r>
-        <w:rPr>
-          <w:sz w:val="26"/>
-          <w:szCs w:val="26"/>
-        </w:rPr>
-        <w:t xml:space="preserve"> for a premium user interface. Improved scalability and efficiency are key advantages, allowing the system to process vast amounts of financial data in real time with minimal manual intervention. By significantly reducing false positives in risk detection, enhancing objectivity, and providing instant feedback, the system effectively mitigates the risks of loan default and financial loss. While traditional systems may rely on static credit scores alone, the holistic approach of Loan Harmony Nexus ensures a comprehensive and robust solution for modern digital lending. Figure 3.4 depicts the comparative analysis of existing systems versus the proposed system, highlighting its superior </w:t>
+        <w:t xml:space="preserve">The Loan Harmony Nexus platform stands out through its innovative features, distinguishing it from traditional bank lending workflows. Notably, it integrates advanced machine learning techniques such as Gradient Boosting and Random Forest to enhance risk detection accuracy and reliability. Additionally, the system leverages a centralized MongoDB database for efficient data management and ReactJS for a premium user interface. Improved scalability and efficiency are key advantages, allowing the system to process vast amounts of financial data in real time with minimal manual intervention. By significantly reducing false positives in risk detection, enhancing objectivity, and providing instant feedback, the system effectively mitigates the risks of loan default and financial loss. While traditional systems may rely on static credit scores alone, the holistic approach of Loan Harmony Nexus ensures a comprehensive and robust solution for modern digital lending. Figure 3.4 depicts the comparative analysis of existing systems versus the proposed system, highlighting its superior </w:t>
       </w:r>
       <w:r>
         <w:rPr>
@@ -12623,15 +11777,7 @@
         <w:jc w:val="both"/>
       </w:pPr>
       <w:r>
-        <w:t xml:space="preserve">The workflow for the Loan Harmony Nexus system is designed to provide an automated, data-driven framework for credit risk evaluation. By integrating advanced ensemble learning models with a modern full-stack architecture, the system ensures objective loan </w:t>
-      </w:r>
-      <w:proofErr w:type="spellStart"/>
-      <w:r>
-        <w:t>decisioning</w:t>
-      </w:r>
-      <w:proofErr w:type="spellEnd"/>
-      <w:r>
-        <w:t xml:space="preserve"> through the following sequential modules:</w:t>
+        <w:t>The workflow for the Loan Harmony Nexus system is designed to provide an automated, data-driven framework for credit risk evaluation. By integrating advanced ensemble learning models with a modern full-stack architecture, the system ensures objective loan decisioning through the following sequential modules:</w:t>
       </w:r>
     </w:p>
     <w:p>
@@ -13047,15 +12193,7 @@
         <w:t>Encoding:</w:t>
       </w:r>
       <w:r>
-        <w:t xml:space="preserve"> Using One-Hot Encoding (</w:t>
-      </w:r>
-      <w:proofErr w:type="spellStart"/>
-      <w:r>
-        <w:t>encoder.pkl</w:t>
-      </w:r>
-      <w:proofErr w:type="spellEnd"/>
-      <w:r>
-        <w:t>) to convert categorical fields like employment status and loan purpose into numerical vectors.</w:t>
+        <w:t xml:space="preserve"> Using One-Hot Encoding (encoder.pkl) to convert categorical fields like employment status and loan purpose into numerical vectors.</w:t>
       </w:r>
     </w:p>
     <w:p>
@@ -13072,23 +12210,7 @@
         <w:t>Normalization:</w:t>
       </w:r>
       <w:r>
-        <w:t xml:space="preserve"> Applying </w:t>
-      </w:r>
-      <w:proofErr w:type="spellStart"/>
-      <w:r>
-        <w:t>StandardScaler</w:t>
-      </w:r>
-      <w:proofErr w:type="spellEnd"/>
-      <w:r>
-        <w:t xml:space="preserve"> (</w:t>
-      </w:r>
-      <w:proofErr w:type="spellStart"/>
-      <w:r>
-        <w:t>scaler.pkl</w:t>
-      </w:r>
-      <w:proofErr w:type="spellEnd"/>
-      <w:r>
-        <w:t>) to scale continuous variables like income and loan amount to a uniform range.</w:t>
+        <w:t xml:space="preserve"> Applying StandardScaler (scaler.pkl) to scale continuous variables like income and loan amount to a uniform range.</w:t>
       </w:r>
     </w:p>
     <w:p>
@@ -13208,19 +12330,11 @@
         <w:ind w:left="142"/>
         <w:jc w:val="both"/>
       </w:pPr>
-      <w:proofErr w:type="spellStart"/>
-      <w:r>
-        <w:rPr>
-          <w:b/>
-        </w:rPr>
-        <w:t>CatBoost</w:t>
-      </w:r>
-      <w:proofErr w:type="spellEnd"/>
-      <w:r>
-        <w:rPr>
-          <w:b/>
-        </w:rPr>
-        <w:t>:</w:t>
+      <w:r>
+        <w:rPr>
+          <w:b/>
+        </w:rPr>
+        <w:t>CatBoost:</w:t>
       </w:r>
       <w:r>
         <w:t xml:space="preserve"> The primary decision engine, optimized for handling categorical features without bias.</w:t>
@@ -13233,19 +12347,11 @@
         <w:ind w:left="142"/>
         <w:jc w:val="both"/>
       </w:pPr>
-      <w:proofErr w:type="spellStart"/>
-      <w:r>
-        <w:rPr>
-          <w:b/>
-        </w:rPr>
-        <w:t>XGBoost</w:t>
-      </w:r>
-      <w:proofErr w:type="spellEnd"/>
-      <w:r>
-        <w:rPr>
-          <w:b/>
-        </w:rPr>
-        <w:t>:</w:t>
+      <w:r>
+        <w:rPr>
+          <w:b/>
+        </w:rPr>
+        <w:t>XGBoost:</w:t>
       </w:r>
       <w:r>
         <w:t xml:space="preserve"> A secondary gradient boosting model used to cross-verify prediction probabilities.</w:t>
@@ -13340,23 +12446,7 @@
         <w:jc w:val="both"/>
       </w:pPr>
       <w:r>
-        <w:t>The finalized models are serialized into a consolidated asset file (</w:t>
-      </w:r>
-      <w:proofErr w:type="spellStart"/>
-      <w:r>
-        <w:t>all_loan_prediction_assets.pkl</w:t>
-      </w:r>
-      <w:proofErr w:type="spellEnd"/>
-      <w:r>
-        <w:t xml:space="preserve">) and deployed via a dedicated prediction </w:t>
-      </w:r>
-      <w:proofErr w:type="spellStart"/>
-      <w:r>
-        <w:t>microservice</w:t>
-      </w:r>
-      <w:proofErr w:type="spellEnd"/>
-      <w:r>
-        <w:t>. This ensures that the ML engine is decoupled from the main application, allowing for independent scaling and updates.</w:t>
+        <w:t>The finalized models are serialized into a consolidated asset file (all_loan_prediction_assets.pkl) and deployed via a dedicated prediction microservice. This ensures that the ML engine is decoupled from the main application, allowing for independent scaling and updates.</w:t>
       </w:r>
     </w:p>
     <w:p>
@@ -13485,39 +12575,7 @@
           <w:sz w:val="28"/>
           <w:szCs w:val="28"/>
         </w:rPr>
-        <w:t xml:space="preserve">The preprocessed data is fed into the ensemble pipeline. </w:t>
-      </w:r>
-      <w:proofErr w:type="spellStart"/>
-      <w:r>
-        <w:rPr>
-          <w:sz w:val="28"/>
-          <w:szCs w:val="28"/>
-        </w:rPr>
-        <w:t>CatBoost</w:t>
-      </w:r>
-      <w:proofErr w:type="spellEnd"/>
-      <w:r>
-        <w:rPr>
-          <w:sz w:val="28"/>
-          <w:szCs w:val="28"/>
-        </w:rPr>
-        <w:t xml:space="preserve">, </w:t>
-      </w:r>
-      <w:proofErr w:type="spellStart"/>
-      <w:r>
-        <w:rPr>
-          <w:sz w:val="28"/>
-          <w:szCs w:val="28"/>
-        </w:rPr>
-        <w:t>XGBoost</w:t>
-      </w:r>
-      <w:proofErr w:type="spellEnd"/>
-      <w:r>
-        <w:rPr>
-          <w:sz w:val="28"/>
-          <w:szCs w:val="28"/>
-        </w:rPr>
-        <w:t xml:space="preserve">, and Random Forest independently calculate the probability of default. The system synthesizes these scores to produce a unified risk coefficient for the applicant.  </w:t>
+        <w:t xml:space="preserve">The preprocessed data is fed into the ensemble pipeline. CatBoost, XGBoost, and Random Forest independently calculate the probability of default. The system synthesizes these scores to produce a unified risk coefficient for the applicant.  </w:t>
       </w:r>
     </w:p>
     <w:p>
@@ -13548,27 +12606,7 @@
           <w:sz w:val="28"/>
           <w:szCs w:val="28"/>
         </w:rPr>
-        <w:t xml:space="preserve">4.3.3 Credit </w:t>
-      </w:r>
-      <w:proofErr w:type="spellStart"/>
-      <w:r>
-        <w:rPr>
-          <w:b/>
-          <w:bCs/>
-          <w:sz w:val="28"/>
-          <w:szCs w:val="28"/>
-        </w:rPr>
-        <w:t>Decisioning</w:t>
-      </w:r>
-      <w:proofErr w:type="spellEnd"/>
-      <w:r>
-        <w:rPr>
-          <w:b/>
-          <w:bCs/>
-          <w:sz w:val="28"/>
-          <w:szCs w:val="28"/>
-        </w:rPr>
-        <w:t xml:space="preserve"> &amp; Categorization:</w:t>
+        <w:t>4.3.3 Credit Decisioning &amp; Categorization:</w:t>
       </w:r>
     </w:p>
     <w:p>
@@ -13911,23 +12949,7 @@
         <w:jc w:val="both"/>
       </w:pPr>
       <w:r>
-        <w:t xml:space="preserve">The project is developed and deployed using a robust technology stack, consisting of Python for the machine learning engine, Node.js (Express) for the backend API, and MongoDB for database management. The frontend is built using React and modern CSS, ensuring a responsive and premium user-friendly interface. For loan risk assessment, the system leverages advanced ensemble learning algorithms, including </w:t>
-      </w:r>
-      <w:proofErr w:type="spellStart"/>
-      <w:r>
-        <w:t>CatBoost</w:t>
-      </w:r>
-      <w:proofErr w:type="spellEnd"/>
-      <w:r>
-        <w:t xml:space="preserve">, </w:t>
-      </w:r>
-      <w:proofErr w:type="spellStart"/>
-      <w:r>
-        <w:t>XGBoost</w:t>
-      </w:r>
-      <w:proofErr w:type="spellEnd"/>
-      <w:r>
-        <w:t>, Random Forest, and Logistic Regression, to analyze financial data and predict applicant creditworthiness. The implementation involves setting up an intuitive web interface, allowing users to submit loan applications and financial profiles for real-time verification. To ensure data integrity and security, the platform employs a centralized data management layer, recording every risk evaluation and its associated metadata in a secure database. This provides a transparent audit trail for all loan decisions, enhancing trust in the automated lending system. The backend server efficiently processes borrower data, calculates key metrics like the Debt-to-Income (DTI) ratio, and retrieves prediction results from the ML engine. Additionally, a comprehensive user profile management system is implemented, enabling users to submit, review, and track their loan application history. The system is designed for continuous improvement, allowing for model retraining as new financial data becomes available to improve accuracy over time.</w:t>
+        <w:t>The project is developed and deployed using a robust technology stack, consisting of Python for the machine learning engine, Node.js (Express) for the backend API, and MongoDB for database management. The frontend is built using React and modern CSS, ensuring a responsive and premium user-friendly interface. For loan risk assessment, the system leverages advanced ensemble learning algorithms, including CatBoost, XGBoost, Random Forest, and Logistic Regression, to analyze financial data and predict applicant creditworthiness. The implementation involves setting up an intuitive web interface, allowing users to submit loan applications and financial profiles for real-time verification. To ensure data integrity and security, the platform employs a centralized data management layer, recording every risk evaluation and its associated metadata in a secure database. This provides a transparent audit trail for all loan decisions, enhancing trust in the automated lending system. The backend server efficiently processes borrower data, calculates key metrics like the Debt-to-Income (DTI) ratio, and retrieves prediction results from the ML engine. Additionally, a comprehensive user profile management system is implemented, enabling users to submit, review, and track their loan application history. The system is designed for continuous improvement, allowing for model retraining as new financial data becomes available to improve accuracy over time.</w:t>
       </w:r>
     </w:p>
     <w:p>
@@ -15720,39 +14742,7 @@
           <w:b w:val="0"/>
           <w:bCs w:val="0"/>
         </w:rPr>
-        <w:t xml:space="preserve">The Loan Harmony Nexus system leverages advanced ensemble learning technologies to create an innovative solution for automated credit risk assessment, effectively addressing the limitations of traditional lending with enhanced accuracy, reliability, and security. By analyzing a broad set of financial features—including income-to-debt ratios, credit scores, and employment stability—the machine learning engine enables precise detection of high-risk loan applications, adapting to complex economic patterns that manual reviews often overlook. The integration of </w:t>
-      </w:r>
-      <w:proofErr w:type="spellStart"/>
-      <w:r>
-        <w:rPr>
-          <w:b w:val="0"/>
-          <w:bCs w:val="0"/>
-        </w:rPr>
-        <w:t>CatBoost</w:t>
-      </w:r>
-      <w:proofErr w:type="spellEnd"/>
-      <w:r>
-        <w:rPr>
-          <w:b w:val="0"/>
-          <w:bCs w:val="0"/>
-        </w:rPr>
-        <w:t xml:space="preserve">, </w:t>
-      </w:r>
-      <w:proofErr w:type="spellStart"/>
-      <w:r>
-        <w:rPr>
-          <w:b w:val="0"/>
-          <w:bCs w:val="0"/>
-        </w:rPr>
-        <w:t>XGBoost</w:t>
-      </w:r>
-      <w:proofErr w:type="spellEnd"/>
-      <w:r>
-        <w:rPr>
-          <w:b w:val="0"/>
-          <w:bCs w:val="0"/>
-        </w:rPr>
-        <w:t>, and Random Forest ensures a robust and impartial decision-making process, minimizing human bias and institutional financial risk. The system’s user-friendly web application, built on a React and Node.js framework, allows seamless deployment, providing financial institutions with a real-time tool to evaluate creditworthiness and improve operational efficiency. With ongoing development, this project holds immense potential for revolutionizing the digital banking landscape, fostering financial inclusion and ensuring a more stable and trustworthy lending environment for both institutions and borrowers.</w:t>
+        <w:t>The Loan Harmony Nexus system leverages advanced ensemble learning technologies to create an innovative solution for automated credit risk assessment, effectively addressing the limitations of traditional lending with enhanced accuracy, reliability, and security. By analyzing a broad set of financial features—including income-to-debt ratios, credit scores, and employment stability—the machine learning engine enables precise detection of high-risk loan applications, adapting to complex economic patterns that manual reviews often overlook. The integration of CatBoost, XGBoost, and Random Forest ensures a robust and impartial decision-making process, minimizing human bias and institutional financial risk. The system’s user-friendly web application, built on a React and Node.js framework, allows seamless deployment, providing financial institutions with a real-time tool to evaluate creditworthiness and improve operational efficiency. With ongoing development, this project holds immense potential for revolutionizing the digital banking landscape, fostering financial inclusion and ensuring a more stable and trustworthy lending environment for both institutions and borrowers.</w:t>
       </w:r>
     </w:p>
     <w:p>
@@ -15879,43 +14869,7 @@
             <w:sz w:val="28"/>
             <w:szCs w:val="28"/>
           </w:rPr>
-          <w:t xml:space="preserve">Kumar, </w:t>
-        </w:r>
-        <w:proofErr w:type="spellStart"/>
-        <w:r>
-          <w:rPr>
-            <w:rStyle w:val="Hyperlink"/>
-            <w:sz w:val="28"/>
-            <w:szCs w:val="28"/>
-          </w:rPr>
-          <w:t>Arun</w:t>
-        </w:r>
-        <w:proofErr w:type="spellEnd"/>
-        <w:r>
-          <w:rPr>
-            <w:rStyle w:val="Hyperlink"/>
-            <w:sz w:val="28"/>
-            <w:szCs w:val="28"/>
-          </w:rPr>
-          <w:t xml:space="preserve">, Ishan Garg, and </w:t>
-        </w:r>
-        <w:proofErr w:type="spellStart"/>
-        <w:r>
-          <w:rPr>
-            <w:rStyle w:val="Hyperlink"/>
-            <w:sz w:val="28"/>
-            <w:szCs w:val="28"/>
-          </w:rPr>
-          <w:t>Sanmeet</w:t>
-        </w:r>
-        <w:proofErr w:type="spellEnd"/>
-        <w:r>
-          <w:rPr>
-            <w:rStyle w:val="Hyperlink"/>
-            <w:sz w:val="28"/>
-            <w:szCs w:val="28"/>
-          </w:rPr>
-          <w:t xml:space="preserve"> Kaur. "Loan Approval Prediction based on Machine Learning Approach." IOSR Journal of Computer Engineering (IOSR-JCE) 18, no. 3 (2016): 79-81.</w:t>
+          <w:t>Kumar, Arun, Ishan Garg, and Sanmeet Kaur. "Loan Approval Prediction based on Machine Learning Approach." IOSR Journal of Computer Engineering (IOSR-JCE) 18, no. 3 (2016): 79-81.</w:t>
         </w:r>
       </w:hyperlink>
     </w:p>
@@ -15935,23 +14889,13 @@
         </w:rPr>
       </w:pPr>
       <w:hyperlink r:id="rId31" w:history="1">
-        <w:proofErr w:type="spellStart"/>
         <w:r>
           <w:rPr>
             <w:rStyle w:val="Hyperlink"/>
             <w:sz w:val="28"/>
             <w:szCs w:val="28"/>
           </w:rPr>
-          <w:t>Nikam</w:t>
-        </w:r>
-        <w:proofErr w:type="spellEnd"/>
-        <w:r>
-          <w:rPr>
-            <w:rStyle w:val="Hyperlink"/>
-            <w:sz w:val="28"/>
-            <w:szCs w:val="28"/>
-          </w:rPr>
-          <w:t>, Shraddha R., and Ashwini S. Kadam. "Prediction for Loan Approval using ML Algorithm." International Research Journal of Engineering and Technology (IRJET) 8, no. 4 (2021).</w:t>
+          <w:t>Nikam, Shraddha R., and Ashwini S. Kadam. "Prediction for Loan Approval using ML Algorithm." International Research Journal of Engineering and Technology (IRJET) 8, no. 4 (2021).</w:t>
         </w:r>
       </w:hyperlink>
     </w:p>
@@ -15971,59 +14915,13 @@
         </w:rPr>
       </w:pPr>
       <w:hyperlink r:id="rId32" w:history="1">
-        <w:proofErr w:type="spellStart"/>
         <w:r>
           <w:rPr>
             <w:rStyle w:val="Hyperlink"/>
             <w:sz w:val="28"/>
             <w:szCs w:val="28"/>
           </w:rPr>
-          <w:t>Aphale</w:t>
-        </w:r>
-        <w:proofErr w:type="spellEnd"/>
-        <w:r>
-          <w:rPr>
-            <w:rStyle w:val="Hyperlink"/>
-            <w:sz w:val="28"/>
-            <w:szCs w:val="28"/>
-          </w:rPr>
-          <w:t xml:space="preserve">, </w:t>
-        </w:r>
-        <w:proofErr w:type="spellStart"/>
-        <w:r>
-          <w:rPr>
-            <w:rStyle w:val="Hyperlink"/>
-            <w:sz w:val="28"/>
-            <w:szCs w:val="28"/>
-          </w:rPr>
-          <w:t>Amruta</w:t>
-        </w:r>
-        <w:proofErr w:type="spellEnd"/>
-        <w:r>
-          <w:rPr>
-            <w:rStyle w:val="Hyperlink"/>
-            <w:sz w:val="28"/>
-            <w:szCs w:val="28"/>
-          </w:rPr>
-          <w:t xml:space="preserve"> S., and Sandeep R. </w:t>
-        </w:r>
-        <w:proofErr w:type="spellStart"/>
-        <w:r>
-          <w:rPr>
-            <w:rStyle w:val="Hyperlink"/>
-            <w:sz w:val="28"/>
-            <w:szCs w:val="28"/>
-          </w:rPr>
-          <w:t>Shinde</w:t>
-        </w:r>
-        <w:proofErr w:type="spellEnd"/>
-        <w:r>
-          <w:rPr>
-            <w:rStyle w:val="Hyperlink"/>
-            <w:sz w:val="28"/>
-            <w:szCs w:val="28"/>
-          </w:rPr>
-          <w:t>. "Predict Loan Approval in Banking System: Machine Learning Approach for Cooperative Banks Loan Approval." International Journal of Engineering Research and Technology (IJERT) 9, no. 8 (2020).</w:t>
+          <w:t>Aphale, Amruta S., and Sandeep R. Shinde. "Predict Loan Approval in Banking System: Machine Learning Approach for Cooperative Banks Loan Approval." International Journal of Engineering Research and Technology (IJERT) 9, no. 8 (2020).</w:t>
         </w:r>
       </w:hyperlink>
     </w:p>
@@ -16043,41 +14941,13 @@
         </w:rPr>
       </w:pPr>
       <w:hyperlink r:id="rId33" w:history="1">
-        <w:proofErr w:type="spellStart"/>
         <w:r>
           <w:rPr>
             <w:rStyle w:val="Hyperlink"/>
             <w:sz w:val="28"/>
             <w:szCs w:val="28"/>
           </w:rPr>
-          <w:t>Nalawade</w:t>
-        </w:r>
-        <w:proofErr w:type="spellEnd"/>
-        <w:r>
-          <w:rPr>
-            <w:rStyle w:val="Hyperlink"/>
-            <w:sz w:val="28"/>
-            <w:szCs w:val="28"/>
-          </w:rPr>
-          <w:t xml:space="preserve">, </w:t>
-        </w:r>
-        <w:proofErr w:type="spellStart"/>
-        <w:r>
-          <w:rPr>
-            <w:rStyle w:val="Hyperlink"/>
-            <w:sz w:val="28"/>
-            <w:szCs w:val="28"/>
-          </w:rPr>
-          <w:t>Shubham</w:t>
-        </w:r>
-        <w:proofErr w:type="spellEnd"/>
-        <w:r>
-          <w:rPr>
-            <w:rStyle w:val="Hyperlink"/>
-            <w:sz w:val="28"/>
-            <w:szCs w:val="28"/>
-          </w:rPr>
-          <w:t>, et al. "Loan Approval Prediction." International Research Journal of Engineering and Technology (IRJET) 9, no. 4 (2022): 669.</w:t>
+          <w:t>Nalawade, Shubham, et al. "Loan Approval Prediction." International Research Journal of Engineering and Technology (IRJET) 9, no. 4 (2022): 669.</w:t>
         </w:r>
       </w:hyperlink>
     </w:p>
@@ -16097,59 +14967,13 @@
         </w:rPr>
       </w:pPr>
       <w:hyperlink r:id="rId34" w:history="1">
-        <w:proofErr w:type="spellStart"/>
         <w:r>
           <w:rPr>
             <w:rStyle w:val="Hyperlink"/>
             <w:sz w:val="28"/>
             <w:szCs w:val="28"/>
           </w:rPr>
-          <w:t>Sinap</w:t>
-        </w:r>
-        <w:proofErr w:type="spellEnd"/>
-        <w:r>
-          <w:rPr>
-            <w:rStyle w:val="Hyperlink"/>
-            <w:sz w:val="28"/>
-            <w:szCs w:val="28"/>
-          </w:rPr>
-          <w:t xml:space="preserve">, </w:t>
-        </w:r>
-        <w:proofErr w:type="spellStart"/>
-        <w:r>
-          <w:rPr>
-            <w:rStyle w:val="Hyperlink"/>
-            <w:sz w:val="28"/>
-            <w:szCs w:val="28"/>
-          </w:rPr>
-          <w:t>Vahid</w:t>
-        </w:r>
-        <w:proofErr w:type="spellEnd"/>
-        <w:r>
-          <w:rPr>
-            <w:rStyle w:val="Hyperlink"/>
-            <w:sz w:val="28"/>
-            <w:szCs w:val="28"/>
-          </w:rPr>
-          <w:t xml:space="preserve">. "A Comparative Study of Loan Approval Prediction Using Machine Learning Methods." </w:t>
-        </w:r>
-        <w:proofErr w:type="spellStart"/>
-        <w:r>
-          <w:rPr>
-            <w:rStyle w:val="Hyperlink"/>
-            <w:sz w:val="28"/>
-            <w:szCs w:val="28"/>
-          </w:rPr>
-          <w:t>Gazi</w:t>
-        </w:r>
-        <w:proofErr w:type="spellEnd"/>
-        <w:r>
-          <w:rPr>
-            <w:rStyle w:val="Hyperlink"/>
-            <w:sz w:val="28"/>
-            <w:szCs w:val="28"/>
-          </w:rPr>
-          <w:t xml:space="preserve"> University Journal of Science Part C: Design and Technology (GUJSC) (2024).</w:t>
+          <w:t>Sinap, Vahid. "A Comparative Study of Loan Approval Prediction Using Machine Learning Methods." Gazi University Journal of Science Part C: Design and Technology (GUJSC) (2024).</w:t>
         </w:r>
       </w:hyperlink>
     </w:p>
@@ -16169,59 +14993,13 @@
         </w:rPr>
       </w:pPr>
       <w:hyperlink r:id="rId35" w:history="1">
-        <w:proofErr w:type="spellStart"/>
         <w:r>
           <w:rPr>
             <w:rStyle w:val="Hyperlink"/>
             <w:sz w:val="28"/>
             <w:szCs w:val="28"/>
           </w:rPr>
-          <w:t>Nureni</w:t>
-        </w:r>
-        <w:proofErr w:type="spellEnd"/>
-        <w:r>
-          <w:rPr>
-            <w:rStyle w:val="Hyperlink"/>
-            <w:sz w:val="28"/>
-            <w:szCs w:val="28"/>
-          </w:rPr>
-          <w:t xml:space="preserve">, </w:t>
-        </w:r>
-        <w:proofErr w:type="spellStart"/>
-        <w:r>
-          <w:rPr>
-            <w:rStyle w:val="Hyperlink"/>
-            <w:sz w:val="28"/>
-            <w:szCs w:val="28"/>
-          </w:rPr>
-          <w:t>Azeez</w:t>
-        </w:r>
-        <w:proofErr w:type="spellEnd"/>
-        <w:r>
-          <w:rPr>
-            <w:rStyle w:val="Hyperlink"/>
-            <w:sz w:val="28"/>
-            <w:szCs w:val="28"/>
-          </w:rPr>
-          <w:t xml:space="preserve"> A., and O. E. </w:t>
-        </w:r>
-        <w:proofErr w:type="spellStart"/>
-        <w:r>
-          <w:rPr>
-            <w:rStyle w:val="Hyperlink"/>
-            <w:sz w:val="28"/>
-            <w:szCs w:val="28"/>
-          </w:rPr>
-          <w:t>Adekola</w:t>
-        </w:r>
-        <w:proofErr w:type="spellEnd"/>
-        <w:r>
-          <w:rPr>
-            <w:rStyle w:val="Hyperlink"/>
-            <w:sz w:val="28"/>
-            <w:szCs w:val="28"/>
-          </w:rPr>
-          <w:t>. "Loan Approval Prediction Based on Machine Learning Approach." FUDMA Journal of Sciences 6, no. 3 (2022).</w:t>
+          <w:t>Nureni, Azeez A., and O. E. Adekola. "Loan Approval Prediction Based on Machine Learning Approach." FUDMA Journal of Sciences 6, no. 3 (2022).</w:t>
         </w:r>
       </w:hyperlink>
     </w:p>
@@ -16241,23 +15019,13 @@
         </w:rPr>
       </w:pPr>
       <w:hyperlink r:id="rId36" w:history="1">
-        <w:proofErr w:type="spellStart"/>
         <w:r>
           <w:rPr>
             <w:rStyle w:val="Hyperlink"/>
             <w:sz w:val="28"/>
             <w:szCs w:val="28"/>
           </w:rPr>
-          <w:t>Alagic</w:t>
-        </w:r>
-        <w:proofErr w:type="spellEnd"/>
-        <w:r>
-          <w:rPr>
-            <w:rStyle w:val="Hyperlink"/>
-            <w:sz w:val="28"/>
-            <w:szCs w:val="28"/>
-          </w:rPr>
-          <w:t>, Adnan, et al. "Machine Learning for an Enhanced Credit Risk Analysis: A Comparative Study of Loan Approval Prediction Models Integrating Mental Health Data." Machine Learning and Knowledge Extraction (MAKE) 6, no. 1 (2024): 4.</w:t>
+          <w:t>Alagic, Adnan, et al. "Machine Learning for an Enhanced Credit Risk Analysis: A Comparative Study of Loan Approval Prediction Models Integrating Mental Health Data." Machine Learning and Knowledge Extraction (MAKE) 6, no. 1 (2024): 4.</w:t>
         </w:r>
       </w:hyperlink>
     </w:p>
@@ -16283,25 +15051,7 @@
             <w:sz w:val="28"/>
             <w:szCs w:val="28"/>
           </w:rPr>
-          <w:t xml:space="preserve">Khan, </w:t>
-        </w:r>
-        <w:proofErr w:type="spellStart"/>
-        <w:r>
-          <w:rPr>
-            <w:rStyle w:val="Hyperlink"/>
-            <w:sz w:val="28"/>
-            <w:szCs w:val="28"/>
-          </w:rPr>
-          <w:t>Afrah</w:t>
-        </w:r>
-        <w:proofErr w:type="spellEnd"/>
-        <w:r>
-          <w:rPr>
-            <w:rStyle w:val="Hyperlink"/>
-            <w:sz w:val="28"/>
-            <w:szCs w:val="28"/>
-          </w:rPr>
-          <w:t>, et al. "Loan Approval Prediction Model: A Comparative Analysis." Advances and Applications in Mathematical Sciences 20, no. 3 (2021): 427-435.</w:t>
+          <w:t>Khan, Afrah, et al. "Loan Approval Prediction Model: A Comparative Analysis." Advances and Applications in Mathematical Sciences 20, no. 3 (2021): 427-435.</w:t>
         </w:r>
       </w:hyperlink>
     </w:p>
@@ -16327,25 +15077,7 @@
             <w:sz w:val="28"/>
             <w:szCs w:val="28"/>
           </w:rPr>
-          <w:t xml:space="preserve">Uddin, </w:t>
-        </w:r>
-        <w:proofErr w:type="spellStart"/>
-        <w:r>
-          <w:rPr>
-            <w:rStyle w:val="Hyperlink"/>
-            <w:sz w:val="28"/>
-            <w:szCs w:val="28"/>
-          </w:rPr>
-          <w:t>Nazim</w:t>
-        </w:r>
-        <w:proofErr w:type="spellEnd"/>
-        <w:r>
-          <w:rPr>
-            <w:rStyle w:val="Hyperlink"/>
-            <w:sz w:val="28"/>
-            <w:szCs w:val="28"/>
-          </w:rPr>
-          <w:t>, et al. "An Ensemble Machine Learning Based Bank Loan Approval Predictions System with a Smart Application." International Journal of Cognitive Computing in Engineering (2023).</w:t>
+          <w:t>Uddin, Nazim, et al. "An Ensemble Machine Learning Based Bank Loan Approval Predictions System with a Smart Application." International Journal of Cognitive Computing in Engineering (2023).</w:t>
         </w:r>
       </w:hyperlink>
     </w:p>
@@ -16365,59 +15097,13 @@
         </w:rPr>
       </w:pPr>
       <w:hyperlink r:id="rId39" w:history="1">
-        <w:proofErr w:type="spellStart"/>
         <w:r>
           <w:rPr>
             <w:rStyle w:val="Hyperlink"/>
             <w:sz w:val="28"/>
             <w:szCs w:val="28"/>
           </w:rPr>
-          <w:t>Güder</w:t>
-        </w:r>
-        <w:proofErr w:type="spellEnd"/>
-        <w:r>
-          <w:rPr>
-            <w:rStyle w:val="Hyperlink"/>
-            <w:sz w:val="28"/>
-            <w:szCs w:val="28"/>
-          </w:rPr>
-          <w:t xml:space="preserve">, Gamze, and </w:t>
-        </w:r>
-        <w:proofErr w:type="spellStart"/>
-        <w:r>
-          <w:rPr>
-            <w:rStyle w:val="Hyperlink"/>
-            <w:sz w:val="28"/>
-            <w:szCs w:val="28"/>
-          </w:rPr>
-          <w:t>Utku</w:t>
-        </w:r>
-        <w:proofErr w:type="spellEnd"/>
-        <w:r>
-          <w:rPr>
-            <w:rStyle w:val="Hyperlink"/>
-            <w:sz w:val="28"/>
-            <w:szCs w:val="28"/>
-          </w:rPr>
-          <w:t xml:space="preserve"> </w:t>
-        </w:r>
-        <w:proofErr w:type="spellStart"/>
-        <w:r>
-          <w:rPr>
-            <w:rStyle w:val="Hyperlink"/>
-            <w:sz w:val="28"/>
-            <w:szCs w:val="28"/>
-          </w:rPr>
-          <w:t>Köse</w:t>
-        </w:r>
-        <w:proofErr w:type="spellEnd"/>
-        <w:r>
-          <w:rPr>
-            <w:rStyle w:val="Hyperlink"/>
-            <w:sz w:val="28"/>
-            <w:szCs w:val="28"/>
-          </w:rPr>
-          <w:t>. "Prediction of Home Loan Approval with Machine Learning." Advances in Artificial Intelligence Research 4, no. 2 (2024): 87-95.</w:t>
+          <w:t>Güder, Gamze, and Utku Köse. "Prediction of Home Loan Approval with Machine Learning." Advances in Artificial Intelligence Research 4, no. 2 (2024): 87-95.</w:t>
         </w:r>
       </w:hyperlink>
     </w:p>
@@ -16556,11 +15242,9 @@
       <w:pStyle w:val="Header"/>
       <w:jc w:val="right"/>
     </w:pPr>
-    <w:proofErr w:type="gramStart"/>
     <w:r>
       <w:t>v</w:t>
     </w:r>
-    <w:proofErr w:type="gramEnd"/>
   </w:p>
 </w:hdr>
 </file>
@@ -16726,7 +15410,7 @@
                               <w:noProof/>
                               <w:spacing w:val="-5"/>
                             </w:rPr>
-                            <w:t>25</w:t>
+                            <w:t>12</w:t>
                           </w:r>
                           <w:r>
                             <w:rPr>
@@ -16792,7 +15476,7 @@
                         <w:noProof/>
                         <w:spacing w:val="-5"/>
                       </w:rPr>
-                      <w:t>25</w:t>
+                      <w:t>12</w:t>
                     </w:r>
                     <w:r>
                       <w:rPr>
@@ -21485,7 +20169,7 @@
 </file>
 
 <file path=customXml/itemProps1.xml><?xml version="1.0" encoding="utf-8"?>
-<ds:datastoreItem xmlns:ds="http://schemas.openxmlformats.org/officeDocument/2006/customXml" ds:itemID="{03049ADA-2C69-4091-A7D7-D87664572D73}">
+<ds:datastoreItem xmlns:ds="http://schemas.openxmlformats.org/officeDocument/2006/customXml" ds:itemID="{F8352ABF-5A4B-4CB3-A383-C66828BC9B2A}">
   <ds:schemaRefs>
     <ds:schemaRef ds:uri="http://schemas.openxmlformats.org/officeDocument/2006/bibliography"/>
   </ds:schemaRefs>

</xml_diff>